<commit_message>
Lab3: replace manual TOC with a real Word TOC field (indexation)
</commit_message>
<xml_diff>
--- a/Lab3/Lab3_PlesuDinu_FAF-241.docx
+++ b/Lab3/Lab3_PlesuDinu_FAF-241.docx
@@ -249,67 +249,87 @@
     </w:p>
     <w:p>
       <w:pPr>
-        <w:spacing w:after="80"/>
-      </w:pPr>
-      <w:r>
+        <w:spacing w:after="130"/>
+      </w:pPr>
+      <w:r>
+        <w:fldChar w:fldCharType="begin" w:dirty="true"/>
+      </w:r>
+      <w:r>
+        <w:instrText xml:space="preserve"> TOC \o "1-2" \h \z \u </w:instrText>
+      </w:r>
+      <w:r>
+        <w:fldChar w:fldCharType="separate"/>
+      </w:r>
+      <w:r>
+        <w:rPr/>
         <w:t>1.  Purpose of the Work</w:t>
       </w:r>
     </w:p>
     <w:p>
       <w:pPr>
-        <w:spacing w:after="80"/>
-      </w:pPr>
-      <w:r>
+        <w:spacing w:after="130"/>
+      </w:pPr>
+      <w:r>
+        <w:rPr/>
         <w:t>2.  Initial Setup</w:t>
       </w:r>
     </w:p>
     <w:p>
       <w:pPr>
-        <w:spacing w:after="80"/>
-      </w:pPr>
-      <w:r>
+        <w:spacing w:after="130"/>
+      </w:pPr>
+      <w:r>
+        <w:rPr/>
         <w:t>3.  Part 1 – Move Fast, Find Help</w:t>
       </w:r>
     </w:p>
     <w:p>
       <w:pPr>
-        <w:spacing w:after="80"/>
-      </w:pPr>
-      <w:r>
+        <w:spacing w:after="130"/>
+      </w:pPr>
+      <w:r>
+        <w:rPr/>
         <w:t>4.  Part 2 – What the Shell Does to Your Line</w:t>
       </w:r>
     </w:p>
     <w:p>
       <w:pPr>
-        <w:spacing w:after="80"/>
-      </w:pPr>
-      <w:r>
+        <w:spacing w:after="130"/>
+      </w:pPr>
+      <w:r>
+        <w:rPr/>
         <w:t>5.  Part 3 – Redirection, Chaining and Jobs</w:t>
       </w:r>
     </w:p>
     <w:p>
       <w:pPr>
-        <w:spacing w:after="80"/>
-      </w:pPr>
-      <w:r>
+        <w:spacing w:after="130"/>
+      </w:pPr>
+      <w:r>
+        <w:rPr/>
         <w:t>6.  Part 4 – Answer Questions with One-Liners</w:t>
       </w:r>
     </w:p>
     <w:p>
       <w:pPr>
-        <w:spacing w:after="80"/>
-      </w:pPr>
-      <w:r>
+        <w:spacing w:after="130"/>
+      </w:pPr>
+      <w:r>
+        <w:rPr/>
         <w:t>7.  Part 5 – My First Script</w:t>
       </w:r>
     </w:p>
     <w:p>
       <w:pPr>
-        <w:spacing w:after="80"/>
-      </w:pPr>
-      <w:r>
+        <w:spacing w:after="130"/>
+      </w:pPr>
+      <w:r>
+        <w:rPr/>
         <w:t>8.  Conclusion</w:t>
       </w:r>
+      <w:r>
+        <w:fldChar w:fldCharType="end"/>
+      </w:r>
     </w:p>
     <w:p>
       <w:r>
@@ -317,6 +337,7 @@
       </w:r>
     </w:p>
     <w:p>
+      <w:bookmarkStart w:id="1001" w:name="_Toc1001"/>
       <w:pPr>
         <w:pStyle w:val="Heading1"/>
       </w:pPr>
@@ -326,6 +347,7 @@
         </w:rPr>
         <w:t>1.  Purpose of the Work</w:t>
       </w:r>
+      <w:bookmarkEnd w:id="1001"/>
     </w:p>
     <w:p>
       <w:pPr>
@@ -336,6 +358,7 @@
       </w:r>
     </w:p>
     <w:p>
+      <w:bookmarkStart w:id="1002" w:name="_Toc1002"/>
       <w:pPr>
         <w:pStyle w:val="Heading1"/>
       </w:pPr>
@@ -345,6 +368,7 @@
         </w:rPr>
         <w:t>2.  Initial Setup</w:t>
       </w:r>
+      <w:bookmarkEnd w:id="1002"/>
     </w:p>
     <w:p>
       <w:pPr>
@@ -487,6 +511,7 @@
       </w:r>
     </w:p>
     <w:p>
+      <w:bookmarkStart w:id="1003" w:name="_Toc1003"/>
       <w:pPr>
         <w:pStyle w:val="Heading1"/>
       </w:pPr>
@@ -496,6 +521,7 @@
         </w:rPr>
         <w:t>3.  Part 1 – Move Fast, Find Help</w:t>
       </w:r>
+      <w:bookmarkEnd w:id="1003"/>
     </w:p>
     <w:p>
       <w:pPr>
@@ -833,6 +859,7 @@
       </w:r>
     </w:p>
     <w:p>
+      <w:bookmarkStart w:id="1004" w:name="_Toc1004"/>
       <w:pPr>
         <w:pStyle w:val="Heading2"/>
       </w:pPr>
@@ -842,6 +869,7 @@
         </w:rPr>
         <w:t>3.1.  Observations</w:t>
       </w:r>
+      <w:bookmarkEnd w:id="1004"/>
     </w:p>
     <w:p>
       <w:pPr>
@@ -876,6 +904,7 @@
       </w:r>
     </w:p>
     <w:p>
+      <w:bookmarkStart w:id="1005" w:name="_Toc1005"/>
       <w:pPr>
         <w:pStyle w:val="Heading1"/>
       </w:pPr>
@@ -885,6 +914,7 @@
         </w:rPr>
         <w:t>4.  Part 2 – What the Shell Does to Your Line</w:t>
       </w:r>
+      <w:bookmarkEnd w:id="1005"/>
     </w:p>
     <w:p>
       <w:pPr>
@@ -1728,6 +1758,7 @@
       </w:tr>
     </w:tbl>
     <w:p>
+      <w:bookmarkStart w:id="1006" w:name="_Toc1006"/>
       <w:pPr>
         <w:pStyle w:val="Heading2"/>
       </w:pPr>
@@ -1737,6 +1768,7 @@
         </w:rPr>
         <w:t>4.1.  Observations</w:t>
       </w:r>
+      <w:bookmarkEnd w:id="1006"/>
     </w:p>
     <w:p>
       <w:pPr>
@@ -1771,6 +1803,7 @@
       </w:r>
     </w:p>
     <w:p>
+      <w:bookmarkStart w:id="1007" w:name="_Toc1007"/>
       <w:pPr>
         <w:pStyle w:val="Heading1"/>
       </w:pPr>
@@ -1780,6 +1813,7 @@
         </w:rPr>
         <w:t>5.  Part 3 – Redirection, Chaining and Jobs</w:t>
       </w:r>
+      <w:bookmarkEnd w:id="1007"/>
     </w:p>
     <w:p>
       <w:pPr>
@@ -2028,6 +2062,7 @@
       </w:r>
     </w:p>
     <w:p>
+      <w:bookmarkStart w:id="1008" w:name="_Toc1008"/>
       <w:pPr>
         <w:pStyle w:val="Heading2"/>
       </w:pPr>
@@ -2037,6 +2072,7 @@
         </w:rPr>
         <w:t>5.1.  Observations</w:t>
       </w:r>
+      <w:bookmarkEnd w:id="1008"/>
     </w:p>
     <w:p>
       <w:pPr>
@@ -2071,6 +2107,7 @@
       </w:r>
     </w:p>
     <w:p>
+      <w:bookmarkStart w:id="1009" w:name="_Toc1009"/>
       <w:pPr>
         <w:pStyle w:val="Heading1"/>
       </w:pPr>
@@ -2080,6 +2117,7 @@
         </w:rPr>
         <w:t>6.  Part 4 – Answer Questions with One-Liners</w:t>
       </w:r>
+      <w:bookmarkEnd w:id="1009"/>
     </w:p>
     <w:p>
       <w:pPr>
@@ -2090,6 +2128,7 @@
       </w:r>
     </w:p>
     <w:p>
+      <w:bookmarkStart w:id="1010" w:name="_Toc1010"/>
       <w:pPr>
         <w:pStyle w:val="Heading2"/>
       </w:pPr>
@@ -2099,6 +2138,7 @@
         </w:rPr>
         <w:t>6.1.  Q1 – How many requests failed?</w:t>
       </w:r>
+      <w:bookmarkEnd w:id="1010"/>
     </w:p>
     <w:p>
       <w:pPr>
@@ -2174,6 +2214,7 @@
       </w:r>
     </w:p>
     <w:p>
+      <w:bookmarkStart w:id="1011" w:name="_Toc1011"/>
       <w:pPr>
         <w:pStyle w:val="Heading2"/>
       </w:pPr>
@@ -2183,6 +2224,7 @@
         </w:rPr>
         <w:t>6.2.  Q2 – How many different pages were requested, and which?</w:t>
       </w:r>
+      <w:bookmarkEnd w:id="1011"/>
     </w:p>
     <w:p>
       <w:pPr>
@@ -2258,6 +2300,7 @@
       </w:r>
     </w:p>
     <w:p>
+      <w:bookmarkStart w:id="1012" w:name="_Toc1012"/>
       <w:pPr>
         <w:pStyle w:val="Heading2"/>
       </w:pPr>
@@ -2267,6 +2310,7 @@
         </w:rPr>
         <w:t>6.3.  Q3 – How many requests did each page get?</w:t>
       </w:r>
+      <w:bookmarkEnd w:id="1012"/>
     </w:p>
     <w:p>
       <w:pPr>
@@ -2342,6 +2386,7 @@
       </w:r>
     </w:p>
     <w:p>
+      <w:bookmarkStart w:id="1013" w:name="_Toc1013"/>
       <w:pPr>
         <w:pStyle w:val="Heading2"/>
       </w:pPr>
@@ -2351,6 +2396,7 @@
         </w:rPr>
         <w:t>6.4.  Q4 – Which user or users have the most failed requests, and how many?</w:t>
       </w:r>
+      <w:bookmarkEnd w:id="1013"/>
     </w:p>
     <w:p>
       <w:pPr>
@@ -2426,6 +2472,7 @@
       </w:r>
     </w:p>
     <w:p>
+      <w:bookmarkStart w:id="1014" w:name="_Toc1014"/>
       <w:pPr>
         <w:pStyle w:val="Heading2"/>
       </w:pPr>
@@ -2435,6 +2482,7 @@
         </w:rPr>
         <w:t>6.5.  Q5 – How many requests did user3 make, and how many of them failed?</w:t>
       </w:r>
+      <w:bookmarkEnd w:id="1014"/>
     </w:p>
     <w:p>
       <w:pPr>
@@ -2510,6 +2558,7 @@
       </w:r>
     </w:p>
     <w:p>
+      <w:bookmarkStart w:id="1015" w:name="_Toc1015"/>
       <w:pPr>
         <w:pStyle w:val="Heading2"/>
       </w:pPr>
@@ -2519,6 +2568,7 @@
         </w:rPr>
         <w:t>6.6.  Q6 – Print the last 3 failed requests, showing only time and user</w:t>
       </w:r>
+      <w:bookmarkEnd w:id="1015"/>
     </w:p>
     <w:p>
       <w:pPr>
@@ -2594,6 +2644,7 @@
       </w:r>
     </w:p>
     <w:p>
+      <w:bookmarkStart w:id="1016" w:name="_Toc1016"/>
       <w:pPr>
         <w:pStyle w:val="Heading2"/>
       </w:pPr>
@@ -2603,6 +2654,7 @@
         </w:rPr>
         <w:t>6.7.  Q7 – Which login shells appear in /etc/passwd, and how many accounts use each?</w:t>
       </w:r>
+      <w:bookmarkEnd w:id="1016"/>
     </w:p>
     <w:p>
       <w:pPr>
@@ -2678,6 +2730,7 @@
       </w:r>
     </w:p>
     <w:p>
+      <w:bookmarkStart w:id="1017" w:name="_Toc1017"/>
       <w:pPr>
         <w:pStyle w:val="Heading2"/>
       </w:pPr>
@@ -2687,6 +2740,7 @@
         </w:rPr>
         <w:t>6.8.  Q8 – Why do the two line counts differ by exactly one?</w:t>
       </w:r>
+      <w:bookmarkEnd w:id="1017"/>
     </w:p>
     <w:p>
       <w:pPr>
@@ -2762,6 +2816,7 @@
       </w:r>
     </w:p>
     <w:p>
+      <w:bookmarkStart w:id="1018" w:name="_Toc1018"/>
       <w:pPr>
         <w:pStyle w:val="Heading2"/>
       </w:pPr>
@@ -2771,6 +2826,7 @@
         </w:rPr>
         <w:t>6.9.  The oneliners.sh File</w:t>
       </w:r>
+      <w:bookmarkEnd w:id="1018"/>
     </w:p>
     <w:p>
       <w:pPr>
@@ -2868,6 +2924,7 @@
       </w:r>
     </w:p>
     <w:p>
+      <w:bookmarkStart w:id="1019" w:name="_Toc1019"/>
       <w:pPr>
         <w:pStyle w:val="Heading2"/>
       </w:pPr>
@@ -2877,6 +2934,7 @@
         </w:rPr>
         <w:t>6.10.  Bonus – Failed requests whose minute ends in 0</w:t>
       </w:r>
+      <w:bookmarkEnd w:id="1019"/>
     </w:p>
     <w:p>
       <w:pPr>
@@ -2944,6 +3002,7 @@
       </w:r>
     </w:p>
     <w:p>
+      <w:bookmarkStart w:id="1020" w:name="_Toc1020"/>
       <w:pPr>
         <w:pStyle w:val="Heading1"/>
       </w:pPr>
@@ -2953,6 +3012,7 @@
         </w:rPr>
         <w:t>7.  Part 5 – My First Script</w:t>
       </w:r>
+      <w:bookmarkEnd w:id="1020"/>
     </w:p>
     <w:p>
       <w:pPr>
@@ -3192,6 +3252,7 @@
       </w:r>
     </w:p>
     <w:p>
+      <w:bookmarkStart w:id="1021" w:name="_Toc1021"/>
       <w:pPr>
         <w:pStyle w:val="Heading2"/>
       </w:pPr>
@@ -3201,6 +3262,7 @@
         </w:rPr>
         <w:t>7.1.  Observations</w:t>
       </w:r>
+      <w:bookmarkEnd w:id="1021"/>
     </w:p>
     <w:p>
       <w:pPr>
@@ -3227,6 +3289,7 @@
       </w:r>
     </w:p>
     <w:p>
+      <w:bookmarkStart w:id="1022" w:name="_Toc1022"/>
       <w:pPr>
         <w:pStyle w:val="Heading1"/>
       </w:pPr>
@@ -3236,6 +3299,7 @@
         </w:rPr>
         <w:t>8.  Conclusion</w:t>
       </w:r>
+      <w:bookmarkEnd w:id="1022"/>
     </w:p>
     <w:p>
       <w:pPr>

</xml_diff>